<commit_message>
Add referee's own header-table convention to the letter
The referee supplied a specimen reference of his own that opens with a
structured table of applicant and referee details. Adopting that layout
matches his habit and mirrors the cover sheet's fields. The position row is
left blank with a note that it must match the cover sheet, since the
specimen describes him as a Lehrbeauftragter, which the cover sheet does
not accept, rather than the research associate the applicant reported.

Co-Authored-By: Claude Opus 5 <noreply@anthropic.com>
Claude-Session: https://claude.ai/code/session_018EEFYAf6pBJaMga5G9Xzjo
</commit_message>
<xml_diff>
--- a/DAAD_Bewerbung/05_Gutachten/Empfehlungsschreiben_Freidinger_Entwurf.docx
+++ b/DAAD_Bewerbung/05_Gutachten/Empfehlungsschreiben_Freidinger_Entwurf.docx
@@ -147,6 +147,438 @@
         </w:rPr>
         <w:t xml:space="preserve">www.dhbw-stuttgart.de</w:t>
       </w:r>
+    </w:p>
+    <w:tbl>
+      <w:tblPr>
+        <w:tblW w:type="dxa" w:w="9020"/>
+        <w:tblBorders>
+          <w:top w:val="single" w:color="auto" w:sz="4"/>
+          <w:left w:val="single" w:color="auto" w:sz="4"/>
+          <w:bottom w:val="single" w:color="auto" w:sz="4"/>
+          <w:right w:val="single" w:color="auto" w:sz="4"/>
+          <w:insideH w:val="single" w:color="auto" w:sz="4"/>
+          <w:insideV w:val="single" w:color="auto" w:sz="4"/>
+        </w:tblBorders>
+      </w:tblPr>
+      <w:tblGrid>
+        <w:gridCol w:w="2700"/>
+        <w:gridCol w:w="6320"/>
+      </w:tblGrid>
+      <w:tr>
+        <w:tc>
+          <w:tcPr>
+            <w:tcW w:type="dxa" w:w="2700"/>
+            <w:tcBorders>
+              <w:top w:val="single" w:color="BFBFBF" w:sz="2"/>
+              <w:left w:val="single" w:color="BFBFBF" w:sz="2"/>
+              <w:bottom w:val="single" w:color="BFBFBF" w:sz="2"/>
+              <w:right w:val="single" w:color="BFBFBF" w:sz="2"/>
+            </w:tcBorders>
+            <w:shd w:fill="F2F2F2" w:val="clear"/>
+            <w:tcMar>
+              <w:top w:type="dxa" w:w="60"/>
+              <w:left w:type="dxa" w:w="110"/>
+              <w:bottom w:type="dxa" w:w="60"/>
+              <w:right w:type="dxa" w:w="110"/>
+            </w:tcMar>
+          </w:tcPr>
+          <w:p>
+            <w:pPr>
+              <w:spacing w:after="0"/>
+            </w:pPr>
+            <w:r>
+              <w:rPr>
+                <w:rFonts w:ascii="Calibri" w:cs="Calibri" w:eastAsia="Calibri" w:hAnsi="Calibri"/>
+                <w:sz w:val="22"/>
+                <w:szCs w:val="22"/>
+              </w:rPr>
+              <w:t xml:space="preserve">Name des Bewerbers</w:t>
+            </w:r>
+          </w:p>
+        </w:tc>
+        <w:tc>
+          <w:tcPr>
+            <w:tcW w:type="dxa" w:w="6320"/>
+            <w:tcBorders>
+              <w:top w:val="single" w:color="BFBFBF" w:sz="2"/>
+              <w:left w:val="single" w:color="BFBFBF" w:sz="2"/>
+              <w:bottom w:val="single" w:color="BFBFBF" w:sz="2"/>
+              <w:right w:val="single" w:color="BFBFBF" w:sz="2"/>
+            </w:tcBorders>
+            <w:tcMar>
+              <w:top w:type="dxa" w:w="60"/>
+              <w:left w:type="dxa" w:w="110"/>
+              <w:bottom w:type="dxa" w:w="60"/>
+              <w:right w:type="dxa" w:w="110"/>
+            </w:tcMar>
+          </w:tcPr>
+          <w:p>
+            <w:pPr>
+              <w:spacing w:after="0"/>
+            </w:pPr>
+            <w:r>
+              <w:rPr>
+                <w:rFonts w:ascii="Calibri" w:cs="Calibri" w:eastAsia="Calibri" w:hAnsi="Calibri"/>
+                <w:sz w:val="22"/>
+                <w:szCs w:val="22"/>
+              </w:rPr>
+              <w:t xml:space="preserve">Tim Rösch</w:t>
+            </w:r>
+          </w:p>
+        </w:tc>
+      </w:tr>
+      <w:tr>
+        <w:tc>
+          <w:tcPr>
+            <w:tcW w:type="dxa" w:w="2700"/>
+            <w:tcBorders>
+              <w:top w:val="single" w:color="BFBFBF" w:sz="2"/>
+              <w:left w:val="single" w:color="BFBFBF" w:sz="2"/>
+              <w:bottom w:val="single" w:color="BFBFBF" w:sz="2"/>
+              <w:right w:val="single" w:color="BFBFBF" w:sz="2"/>
+            </w:tcBorders>
+            <w:shd w:fill="F2F2F2" w:val="clear"/>
+            <w:tcMar>
+              <w:top w:type="dxa" w:w="60"/>
+              <w:left w:type="dxa" w:w="110"/>
+              <w:bottom w:type="dxa" w:w="60"/>
+              <w:right w:type="dxa" w:w="110"/>
+            </w:tcMar>
+          </w:tcPr>
+          <w:p>
+            <w:pPr>
+              <w:spacing w:after="0"/>
+            </w:pPr>
+            <w:r>
+              <w:rPr>
+                <w:rFonts w:ascii="Calibri" w:cs="Calibri" w:eastAsia="Calibri" w:hAnsi="Calibri"/>
+                <w:sz w:val="22"/>
+                <w:szCs w:val="22"/>
+              </w:rPr>
+              <w:t xml:space="preserve">Kontaktdaten</w:t>
+            </w:r>
+          </w:p>
+        </w:tc>
+        <w:tc>
+          <w:tcPr>
+            <w:tcW w:type="dxa" w:w="6320"/>
+            <w:tcBorders>
+              <w:top w:val="single" w:color="BFBFBF" w:sz="2"/>
+              <w:left w:val="single" w:color="BFBFBF" w:sz="2"/>
+              <w:bottom w:val="single" w:color="BFBFBF" w:sz="2"/>
+              <w:right w:val="single" w:color="BFBFBF" w:sz="2"/>
+            </w:tcBorders>
+            <w:tcMar>
+              <w:top w:type="dxa" w:w="60"/>
+              <w:left w:type="dxa" w:w="110"/>
+              <w:bottom w:type="dxa" w:w="60"/>
+              <w:right w:type="dxa" w:w="110"/>
+            </w:tcMar>
+          </w:tcPr>
+          <w:p>
+            <w:pPr>
+              <w:spacing w:after="0"/>
+            </w:pPr>
+            <w:r>
+              <w:rPr>
+                <w:rFonts w:ascii="Calibri" w:cs="Calibri" w:eastAsia="Calibri" w:hAnsi="Calibri"/>
+                <w:sz w:val="22"/>
+                <w:szCs w:val="22"/>
+              </w:rPr>
+              <w:t xml:space="preserve">tim.roeschkh@gmail.com · +49 176 47299077</w:t>
+            </w:r>
+          </w:p>
+        </w:tc>
+      </w:tr>
+      <w:tr>
+        <w:tc>
+          <w:tcPr>
+            <w:tcW w:type="dxa" w:w="2700"/>
+            <w:tcBorders>
+              <w:top w:val="single" w:color="BFBFBF" w:sz="2"/>
+              <w:left w:val="single" w:color="BFBFBF" w:sz="2"/>
+              <w:bottom w:val="single" w:color="BFBFBF" w:sz="2"/>
+              <w:right w:val="single" w:color="BFBFBF" w:sz="2"/>
+            </w:tcBorders>
+            <w:shd w:fill="F2F2F2" w:val="clear"/>
+            <w:tcMar>
+              <w:top w:type="dxa" w:w="60"/>
+              <w:left w:type="dxa" w:w="110"/>
+              <w:bottom w:type="dxa" w:w="60"/>
+              <w:right w:type="dxa" w:w="110"/>
+            </w:tcMar>
+          </w:tcPr>
+          <w:p>
+            <w:pPr>
+              <w:spacing w:after="0"/>
+            </w:pPr>
+            <w:r>
+              <w:rPr>
+                <w:rFonts w:ascii="Calibri" w:cs="Calibri" w:eastAsia="Calibri" w:hAnsi="Calibri"/>
+                <w:sz w:val="22"/>
+                <w:szCs w:val="22"/>
+              </w:rPr>
+              <w:t xml:space="preserve">Akademischer Grad</w:t>
+            </w:r>
+          </w:p>
+        </w:tc>
+        <w:tc>
+          <w:tcPr>
+            <w:tcW w:type="dxa" w:w="6320"/>
+            <w:tcBorders>
+              <w:top w:val="single" w:color="BFBFBF" w:sz="2"/>
+              <w:left w:val="single" w:color="BFBFBF" w:sz="2"/>
+              <w:bottom w:val="single" w:color="BFBFBF" w:sz="2"/>
+              <w:right w:val="single" w:color="BFBFBF" w:sz="2"/>
+            </w:tcBorders>
+            <w:tcMar>
+              <w:top w:type="dxa" w:w="60"/>
+              <w:left w:type="dxa" w:w="110"/>
+              <w:bottom w:type="dxa" w:w="60"/>
+              <w:right w:type="dxa" w:w="110"/>
+            </w:tcMar>
+          </w:tcPr>
+          <w:p>
+            <w:pPr>
+              <w:spacing w:after="0"/>
+            </w:pPr>
+            <w:r>
+              <w:rPr>
+                <w:rFonts w:ascii="Calibri" w:cs="Calibri" w:eastAsia="Calibri" w:hAnsi="Calibri"/>
+                <w:sz w:val="22"/>
+                <w:szCs w:val="22"/>
+              </w:rPr>
+              <w:t xml:space="preserve">Bachelor of Science — Wirtschaftsinformatik (International Management for Business &amp; IT), DHBW Stuttgart</w:t>
+            </w:r>
+          </w:p>
+        </w:tc>
+      </w:tr>
+      <w:tr>
+        <w:tc>
+          <w:tcPr>
+            <w:tcW w:type="dxa" w:w="2700"/>
+            <w:tcBorders>
+              <w:top w:val="single" w:color="BFBFBF" w:sz="2"/>
+              <w:left w:val="single" w:color="BFBFBF" w:sz="2"/>
+              <w:bottom w:val="single" w:color="BFBFBF" w:sz="2"/>
+              <w:right w:val="single" w:color="BFBFBF" w:sz="2"/>
+            </w:tcBorders>
+            <w:shd w:fill="F2F2F2" w:val="clear"/>
+            <w:tcMar>
+              <w:top w:type="dxa" w:w="60"/>
+              <w:left w:type="dxa" w:w="110"/>
+              <w:bottom w:type="dxa" w:w="60"/>
+              <w:right w:type="dxa" w:w="110"/>
+            </w:tcMar>
+          </w:tcPr>
+          <w:p>
+            <w:pPr>
+              <w:spacing w:after="0"/>
+            </w:pPr>
+            <w:r>
+              <w:rPr>
+                <w:rFonts w:ascii="Calibri" w:cs="Calibri" w:eastAsia="Calibri" w:hAnsi="Calibri"/>
+                <w:sz w:val="22"/>
+                <w:szCs w:val="22"/>
+              </w:rPr>
+              <w:t xml:space="preserve">Name des Referenzgebers</w:t>
+            </w:r>
+          </w:p>
+        </w:tc>
+        <w:tc>
+          <w:tcPr>
+            <w:tcW w:type="dxa" w:w="6320"/>
+            <w:tcBorders>
+              <w:top w:val="single" w:color="BFBFBF" w:sz="2"/>
+              <w:left w:val="single" w:color="BFBFBF" w:sz="2"/>
+              <w:bottom w:val="single" w:color="BFBFBF" w:sz="2"/>
+              <w:right w:val="single" w:color="BFBFBF" w:sz="2"/>
+            </w:tcBorders>
+            <w:tcMar>
+              <w:top w:type="dxa" w:w="60"/>
+              <w:left w:type="dxa" w:w="110"/>
+              <w:bottom w:type="dxa" w:w="60"/>
+              <w:right w:type="dxa" w:w="110"/>
+            </w:tcMar>
+          </w:tcPr>
+          <w:p>
+            <w:pPr>
+              <w:spacing w:after="0"/>
+            </w:pPr>
+            <w:r>
+              <w:rPr>
+                <w:rFonts w:ascii="Calibri" w:cs="Calibri" w:eastAsia="Calibri" w:hAnsi="Calibri"/>
+                <w:sz w:val="22"/>
+                <w:szCs w:val="22"/>
+                <w:highlight w:val="yellow"/>
+                <w:highlightCs w:val="yellow"/>
+              </w:rPr>
+              <w:t xml:space="preserve">[Titel]</w:t>
+            </w:r>
+            <w:r>
+              <w:rPr>
+                <w:rFonts w:ascii="Calibri" w:cs="Calibri" w:eastAsia="Calibri" w:hAnsi="Calibri"/>
+                <w:sz w:val="22"/>
+                <w:szCs w:val="22"/>
+              </w:rPr>
+              <w:t xml:space="preserve"> Freidinger</w:t>
+            </w:r>
+          </w:p>
+        </w:tc>
+      </w:tr>
+      <w:tr>
+        <w:tc>
+          <w:tcPr>
+            <w:tcW w:type="dxa" w:w="2700"/>
+            <w:tcBorders>
+              <w:top w:val="single" w:color="BFBFBF" w:sz="2"/>
+              <w:left w:val="single" w:color="BFBFBF" w:sz="2"/>
+              <w:bottom w:val="single" w:color="BFBFBF" w:sz="2"/>
+              <w:right w:val="single" w:color="BFBFBF" w:sz="2"/>
+            </w:tcBorders>
+            <w:shd w:fill="F2F2F2" w:val="clear"/>
+            <w:tcMar>
+              <w:top w:type="dxa" w:w="60"/>
+              <w:left w:type="dxa" w:w="110"/>
+              <w:bottom w:type="dxa" w:w="60"/>
+              <w:right w:type="dxa" w:w="110"/>
+            </w:tcMar>
+          </w:tcPr>
+          <w:p>
+            <w:pPr>
+              <w:spacing w:after="0"/>
+            </w:pPr>
+            <w:r>
+              <w:rPr>
+                <w:rFonts w:ascii="Calibri" w:cs="Calibri" w:eastAsia="Calibri" w:hAnsi="Calibri"/>
+                <w:sz w:val="22"/>
+                <w:szCs w:val="22"/>
+              </w:rPr>
+              <w:t xml:space="preserve">Kontaktdaten</w:t>
+            </w:r>
+          </w:p>
+        </w:tc>
+        <w:tc>
+          <w:tcPr>
+            <w:tcW w:type="dxa" w:w="6320"/>
+            <w:tcBorders>
+              <w:top w:val="single" w:color="BFBFBF" w:sz="2"/>
+              <w:left w:val="single" w:color="BFBFBF" w:sz="2"/>
+              <w:bottom w:val="single" w:color="BFBFBF" w:sz="2"/>
+              <w:right w:val="single" w:color="BFBFBF" w:sz="2"/>
+            </w:tcBorders>
+            <w:tcMar>
+              <w:top w:type="dxa" w:w="60"/>
+              <w:left w:type="dxa" w:w="110"/>
+              <w:bottom w:type="dxa" w:w="60"/>
+              <w:right w:type="dxa" w:w="110"/>
+            </w:tcMar>
+          </w:tcPr>
+          <w:p>
+            <w:pPr>
+              <w:spacing w:after="0"/>
+            </w:pPr>
+            <w:r>
+              <w:rPr>
+                <w:rFonts w:ascii="Calibri" w:cs="Calibri" w:eastAsia="Calibri" w:hAnsi="Calibri"/>
+                <w:sz w:val="22"/>
+                <w:szCs w:val="22"/>
+                <w:highlight w:val="yellow"/>
+                <w:highlightCs w:val="yellow"/>
+              </w:rPr>
+              <w:t xml:space="preserve">[E-Mail]</w:t>
+            </w:r>
+            <w:r>
+              <w:rPr>
+                <w:rFonts w:ascii="Calibri" w:cs="Calibri" w:eastAsia="Calibri" w:hAnsi="Calibri"/>
+                <w:sz w:val="22"/>
+                <w:szCs w:val="22"/>
+              </w:rPr>
+              <w:t xml:space="preserve"> · </w:t>
+            </w:r>
+            <w:r>
+              <w:rPr>
+                <w:rFonts w:ascii="Calibri" w:cs="Calibri" w:eastAsia="Calibri" w:hAnsi="Calibri"/>
+                <w:sz w:val="22"/>
+                <w:szCs w:val="22"/>
+                <w:highlight w:val="yellow"/>
+                <w:highlightCs w:val="yellow"/>
+              </w:rPr>
+              <w:t xml:space="preserve">[Telefon]</w:t>
+            </w:r>
+          </w:p>
+        </w:tc>
+      </w:tr>
+      <w:tr>
+        <w:tc>
+          <w:tcPr>
+            <w:tcW w:type="dxa" w:w="2700"/>
+            <w:tcBorders>
+              <w:top w:val="single" w:color="BFBFBF" w:sz="2"/>
+              <w:left w:val="single" w:color="BFBFBF" w:sz="2"/>
+              <w:bottom w:val="single" w:color="BFBFBF" w:sz="2"/>
+              <w:right w:val="single" w:color="BFBFBF" w:sz="2"/>
+            </w:tcBorders>
+            <w:shd w:fill="F2F2F2" w:val="clear"/>
+            <w:tcMar>
+              <w:top w:type="dxa" w:w="60"/>
+              <w:left w:type="dxa" w:w="110"/>
+              <w:bottom w:type="dxa" w:w="60"/>
+              <w:right w:type="dxa" w:w="110"/>
+            </w:tcMar>
+          </w:tcPr>
+          <w:p>
+            <w:pPr>
+              <w:spacing w:after="0"/>
+            </w:pPr>
+            <w:r>
+              <w:rPr>
+                <w:rFonts w:ascii="Calibri" w:cs="Calibri" w:eastAsia="Calibri" w:hAnsi="Calibri"/>
+                <w:sz w:val="22"/>
+                <w:szCs w:val="22"/>
+              </w:rPr>
+              <w:t xml:space="preserve">Funktion/Position</w:t>
+            </w:r>
+          </w:p>
+        </w:tc>
+        <w:tc>
+          <w:tcPr>
+            <w:tcW w:type="dxa" w:w="6320"/>
+            <w:tcBorders>
+              <w:top w:val="single" w:color="BFBFBF" w:sz="2"/>
+              <w:left w:val="single" w:color="BFBFBF" w:sz="2"/>
+              <w:bottom w:val="single" w:color="BFBFBF" w:sz="2"/>
+              <w:right w:val="single" w:color="BFBFBF" w:sz="2"/>
+            </w:tcBorders>
+            <w:tcMar>
+              <w:top w:type="dxa" w:w="60"/>
+              <w:left w:type="dxa" w:w="110"/>
+              <w:bottom w:type="dxa" w:w="60"/>
+              <w:right w:type="dxa" w:w="110"/>
+            </w:tcMar>
+          </w:tcPr>
+          <w:p>
+            <w:pPr>
+              <w:spacing w:after="0"/>
+            </w:pPr>
+            <w:r>
+              <w:rPr>
+                <w:rFonts w:ascii="Calibri" w:cs="Calibri" w:eastAsia="Calibri" w:hAnsi="Calibri"/>
+                <w:sz w:val="22"/>
+                <w:szCs w:val="22"/>
+                <w:highlight w:val="yellow"/>
+                <w:highlightCs w:val="yellow"/>
+              </w:rPr>
+              <w:t xml:space="preserve">[Funktion — bitte exakt angeben; muss mit dem DAAD-Deckblatt übereinstimmen]</w:t>
+            </w:r>
+          </w:p>
+        </w:tc>
+      </w:tr>
+    </w:tbl>
+    <w:p>
+      <w:pPr>
+        <w:spacing w:after="300"/>
+      </w:pPr>
     </w:p>
     <w:p>
       <w:pPr>

</xml_diff>

<commit_message>
Close the two gaps against DAAD's questions for referees
The letter now answers all four questions the DAAD puts to a referee. Adds
an observed-behaviour paragraph on how the applicant works, rendered as
conduct in class rather than adjectives, and a paragraph separating the
academic from the professional significance of the year abroad, which the
criteria ask about separately. Trims the project paragraph to hold the
length.

Co-Authored-By: Claude Opus 5 <noreply@anthropic.com>
Claude-Session: https://claude.ai/code/session_018EEFYAf6pBJaMga5G9Xzjo
</commit_message>
<xml_diff>
--- a/DAAD_Bewerbung/05_Gutachten/Empfehlungsschreiben_Freidinger_Entwurf.docx
+++ b/DAAD_Bewerbung/05_Gutachten/Empfehlungsschreiben_Freidinger_Entwurf.docx
@@ -771,7 +771,7 @@
           <w:sz w:val="22"/>
           <w:szCs w:val="22"/>
         </w:rPr>
-        <w:t xml:space="preserve">Der vorgelegte Studienplan ist fachlich tragfähig und in der vorgesehenen Zeit umsetzbar. Bemerkenswert erscheint mir vor allem seine Einbettung in den bisherigen Werdegang. Was Herr Rösch bislang gelernt hat, betrifft die Modellierung und Verbesserung von Geschäftsprozessen, also die Informationsebene betrieblicher Abläufe. Der MPhil in Industrial Systems, Manufacture and Management ergänzt diese Ausbildung um die physische Fertigungsebene: um Fertigungsverfahren, Anlagen und Werksabläufe. Das ist kein Fachwechsel, sondern die konsequente Erweiterung einer Perspektive, die ohne diese zweite Ebene unvollständig bleibt. Sein Studienplan benennt diese Lücke und adressiert sie gezielt.</w:t>
+        <w:t xml:space="preserve">Der vorgelegte Studienplan ist fachlich tragfähig und in der vorgesehenen Zeit umsetzbar. Bemerkenswert erscheint mir vor allem seine Einbettung in den bisherigen Werdegang. Was Herr Rösch bislang gelernt hat, betrifft die Modellierung und Verbesserung von Geschäftsprozessen, also die Informationsebene betrieblicher Abläufe. Der MPhil in Industrial Systems, Manufacture and Management ergänzt diese Ausbildung um die physische Fertigungsebene: um Fertigungsverfahren, Anlagen und Werksabläufe. Das ist kein Fachwechsel, sondern die Erweiterung einer Perspektive, die ohne diese zweite Ebene unvollständig bleibt.</w:t>
       </w:r>
     </w:p>
     <w:p>
@@ -800,7 +800,49 @@
           <w:sz w:val="22"/>
           <w:szCs w:val="22"/>
         </w:rPr>
-        <w:t xml:space="preserve">Die Gründe für das Vorhaben halte ich für tragfähig. Herr Rösch hat sie mir gegenüber mehrfach und in zunehmender fachlicher Schärfe dargelegt; es handelt sich erkennbar nicht um eine kurzfristige Entscheidung für einen renommierten Studienort. Nach diesem Studium wird er beurteilen können, wie sich Prozessgestaltung und Datenanalyse unter den Bedingungen realer Produktion verhalten — eine Verbindung, die in beiden Herkunftsdisziplinen selten ausgebildet wird. Das in der Bewerbung dokumentierte ehrenamtliche Engagement lief neben dem Studium, ohne dass die fachliche Leistung in meinem Modul darunter gelitten hätte; das spricht für seine Fähigkeit, Verantwortung und Arbeitspensum miteinander zu vereinbaren.</w:t>
+        <w:t xml:space="preserve">Die Gründe für das Vorhaben halte ich für tragfähig. Herr Rösch hat sie mir gegenüber mehrfach und in zunehmender fachlicher Schärfe dargelegt; es handelt sich erkennbar nicht um eine kurzfristige Entscheidung für einen renommierten Studienort.</w:t>
+      </w:r>
+    </w:p>
+    <w:p>
+      <w:pPr>
+        <w:spacing w:after="180" w:line="276"/>
+        <w:jc w:val="both"/>
+      </w:pPr>
+      <w:r>
+        <w:rPr>
+          <w:rFonts w:ascii="Calibri" w:cs="Calibri" w:eastAsia="Calibri" w:hAnsi="Calibri"/>
+          <w:sz w:val="22"/>
+          <w:szCs w:val="22"/>
+        </w:rPr>
+        <w:t xml:space="preserve">In meinen Lehrveranstaltungen ist er durch Fragen aufgefallen, die regelmäßig über den behandelten Stoff hinausgingen und auf die Anwendbarkeit der Methoden zielten. Ebenso habe ich beobachtet, dass er Kommilitoninnen und Kommilitonen Zusammenhänge erklärte, die diesen Schwierigkeiten bereiteten — eine Bereitschaft, die im Prüfungsbetrieb keineswegs selbstverständlich ist.</w:t>
+      </w:r>
+    </w:p>
+    <w:p>
+      <w:pPr>
+        <w:spacing w:after="180" w:line="276"/>
+        <w:jc w:val="both"/>
+      </w:pPr>
+      <w:r>
+        <w:rPr>
+          <w:rFonts w:ascii="Calibri" w:cs="Calibri" w:eastAsia="Calibri" w:hAnsi="Calibri"/>
+          <w:sz w:val="22"/>
+          <w:szCs w:val="22"/>
+        </w:rPr>
+        <w:t xml:space="preserve">Die Bedeutung des Aufenthalts sehe ich auf zwei Ebenen. Wissenschaftlich ist die Dissertation die erste Arbeit, in der er ein industrielles Problem methodisch geführt bearbeitet; das Modul Research Methods bereitet dies eigens vor. Beruflich zielt er nach seiner mir dargelegten Planung auf eine Spezialisierung an der Schnittstelle von Operations und digitalen Technologien — ein Feld, das Fertigungswissen, Datenanalyse und Beratungspraxis zugleich verlangt und für das es in Deutschland kaum einen geregelten Ausbildungsweg gibt.</w:t>
+      </w:r>
+    </w:p>
+    <w:p>
+      <w:pPr>
+        <w:spacing w:after="180" w:line="276"/>
+        <w:jc w:val="both"/>
+      </w:pPr>
+      <w:r>
+        <w:rPr>
+          <w:rFonts w:ascii="Calibri" w:cs="Calibri" w:eastAsia="Calibri" w:hAnsi="Calibri"/>
+          <w:sz w:val="22"/>
+          <w:szCs w:val="22"/>
+        </w:rPr>
+        <w:t xml:space="preserve">Das in der Bewerbung dokumentierte ehrenamtliche Engagement lief neben dem Studium, ohne dass die fachliche Leistung in meinem Modul darunter gelitten hätte.</w:t>
       </w:r>
     </w:p>
     <w:p>

</xml_diff>

<commit_message>
Tighten four weak spots in the referee letter
Capitalises the sentence after the first sub-heading; replaces the vague
upper range of the cohort with the top five percent the transcript
supports; glosses process mining for a committee outside the field; and
lifts the English-language assessment out of a trailing clause into its own
sentence, since it is the only evidence of language ability in the file
until a certificate exists.

Co-Authored-By: Claude Opus 5 <noreply@anthropic.com>
Claude-Session: https://claude.ai/code/session_018EEFYAf6pBJaMga5G9Xzjo
</commit_message>
<xml_diff>
--- a/DAAD_Bewerbung/05_Gutachten/Empfehlungsschreiben_Freidinger_Entwurf.docx
+++ b/DAAD_Bewerbung/05_Gutachten/Empfehlungsschreiben_Freidinger_Entwurf.docx
@@ -671,7 +671,7 @@
           <w:sz w:val="22"/>
           <w:szCs w:val="22"/>
         </w:rPr>
-        <w:t xml:space="preserve">ich habe Herrn Tim Rösch im Modul „Geschäftsprozesse und deren Umsetzung“ (W3WI_106) im dritten Studienjahr des Studiengangs Wirtschaftsinformatik – International Management for Business &amp; IT an der Dualen Hochschule Baden-Württemberg Stuttgart unterrichtet und geprüft. Darüber hinaus habe ich mit ihm mehrfach fachliche Gespräche geführt, unter anderem über das hier zu beurteilende Studienvorhaben. Meine vergleichende Einschätzung auf dem Deckblatt bezieht sich auf die über tausend Studierenden, die ich seit 1995 in meiner Lehrtätigkeit unterrichtet habe.</w:t>
+        <w:t xml:space="preserve">Ich habe Herrn Tim Rösch im Modul „Geschäftsprozesse und deren Umsetzung“ (W3WI_106) im dritten Studienjahr des Studiengangs Wirtschaftsinformatik – International Management for Business &amp; IT an der Dualen Hochschule Baden-Württemberg Stuttgart unterrichtet und geprüft. Darüber hinaus habe ich mit ihm mehrfach fachliche Gespräche geführt, unter anderem über das hier zu beurteilende Studienvorhaben. Meine vergleichende Einschätzung auf dem Deckblatt bezieht sich auf die über tausend Studierenden, die ich seit 1995 in meiner Lehrtätigkeit unterrichtet habe.</w:t>
       </w:r>
     </w:p>
     <w:p>
@@ -700,7 +700,7 @@
           <w:sz w:val="22"/>
           <w:szCs w:val="22"/>
         </w:rPr>
-        <w:t xml:space="preserve">Herr Rösch schloss mein Modul mit der Note 1,0 ab. Sein Notendurchschnitt von 1,3 liegt im oberen Bereich seines Jahrgangs, und seine Leistungen haben sich über den gesamten Studienverlauf auf diesem Niveau gehalten.</w:t>
+        <w:t xml:space="preserve">Herr Rösch schloss mein Modul mit der Note 1,0 ab. Sein Notendurchschnitt von 1,3 weist ihn nach den vorliegenden Unterlagen den besten fünf Prozent seines Jahrgangs zu; seine Leistungen haben sich über den gesamten Studienverlauf auf diesem Niveau gehalten.</w:t>
       </w:r>
     </w:p>
     <w:p>
@@ -714,7 +714,7 @@
           <w:sz w:val="22"/>
           <w:szCs w:val="22"/>
         </w:rPr>
-        <w:t xml:space="preserve">Das Modul behandelt die formale Modellierung von Leistungsprozessen mit Petri-Netzen, ereignisgesteuerten Prozessketten und BPMN, ferner Prozesscontrolling, Business Process Reengineering, Process Mining sowie Ansätze des Lean Managements. Herr Rösch beherrschte diese Methoden nicht allein in ihrer formalen Anwendung. Er konnte beurteilen, welches Verfahren in einer konkreten betrieblichen Situation trägt und welches an ihr vorbeigeht — eine Unterscheidung, die erfahrungsgemäß erst wenige Studierende dieses Studienjahrs sicher treffen.</w:t>
+        <w:t xml:space="preserve">Das Modul behandelt die formale Modellierung von Leistungsprozessen mit Petri-Netzen, ereignisgesteuerten Prozessketten und BPMN, ferner Prozesscontrolling, Business Process Reengineering, Lean Management sowie Process Mining — die Rekonstruktion tatsächlicher Abläufe aus den Datenspuren betrieblicher Systeme. Herr Rösch beherrschte diese Methoden nicht allein in ihrer formalen Anwendung. Er konnte beurteilen, welches Verfahren in einer konkreten betrieblichen Situation trägt und welches an ihr vorbeigeht — eine Unterscheidung, die erfahrungsgemäß erst wenige Studierende dieses Studienjahrs sicher treffen.</w:t>
       </w:r>
     </w:p>
     <w:p>
@@ -742,7 +742,21 @@
           <w:sz w:val="22"/>
           <w:szCs w:val="22"/>
         </w:rPr>
-        <w:t xml:space="preserve">Der Gegenstand der Bachelorarbeit von Herrn Rösch — ein KI-gestütztes Prüftool für Due-Diligence-Berichte — ist mir inhaltlich bekannt; betreut habe ich die Arbeit nicht. Sie wurde nach den vorliegenden Unterlagen mit 1,0 bewertet. Die englische Arbeitssprache halte ich für kein Hindernis: Mein Modul wird teilweise englischsprachig durchgeführt, und Herr Rösch hat darin ohne erkennbare Einschränkung gearbeitet.</w:t>
+        <w:t xml:space="preserve">Der Gegenstand der Bachelorarbeit von Herrn Rösch — ein KI-gestütztes Prüftool für Due-Diligence-Berichte — ist mir inhaltlich bekannt; betreut habe ich die Arbeit nicht. Sie wurde nach den vorliegenden Unterlagen mit 1,0 bewertet.</w:t>
+      </w:r>
+    </w:p>
+    <w:p>
+      <w:pPr>
+        <w:spacing w:after="180" w:line="276"/>
+        <w:jc w:val="both"/>
+      </w:pPr>
+      <w:r>
+        <w:rPr>
+          <w:rFonts w:ascii="Calibri" w:cs="Calibri" w:eastAsia="Calibri" w:hAnsi="Calibri"/>
+          <w:sz w:val="22"/>
+          <w:szCs w:val="22"/>
+        </w:rPr>
+        <w:t xml:space="preserve">Die englische Arbeitssprache halte ich für kein Hindernis. Mein Modul wird teilweise englischsprachig durchgeführt; Herr Rösch hat darin ohne erkennbare Einschränkung gearbeitet, sowohl schriftlich als auch in der mündlichen Beteiligung.</w:t>
       </w:r>
     </w:p>
     <w:p>

</xml_diff>